<commit_message>
docs: update project evidence and data protection scope
</commit_message>
<xml_diff>
--- a/Fase 1/Evidencias Grupales/1.5_GuiaEstudiante_Fase 1_Definicion Proyecto APT.docx
+++ b/Fase 1/Evidencias Grupales/1.5_GuiaEstudiante_Fase 1_Definicion Proyecto APT.docx
@@ -1627,16 +1627,8 @@
               <w:ind w:left="0" w:right="0" w:firstLine="0"/>
               <w:jc w:val="left"/>
               <w:rPr>
-                <w:rFonts w:ascii="Calibri" w:cs="Calibri" w:eastAsia="Calibri" w:hAnsi="Calibri"/>
-                <w:b w:val="0"/>
-                <w:bCs w:val="0"/>
-                <w:smallCaps w:val="0"/>
-                <w:strike w:val="0"/>
-                <w:sz w:val="20"/>
-                <w:szCs w:val="20"/>
-                <w:u w:val="none"/>
-                <w:shd w:fill="auto" w:val="clear"/>
-                <w:vertAlign w:val="baseline"/>
+                <w:sz w:val="20"/>
+                <w:szCs w:val="20"/>
               </w:rPr>
             </w:pPr>
             <w:r>
@@ -1646,6 +1638,37 @@
                 <w:rtl w:val="0"/>
               </w:rPr>
               <w:t xml:space="preserve">El proyecto es factible de desarrollar durante el semestre y dentro de las horas asignadas a la asignatura, utilizando los conocimientos y herramientas disponibles para el equipo. Se requerirán herramientas de programación, base de datos, servicios necesarios para implementar la plataforma, IA como apoyo y nuestro equipo como equipo de desarrollo. Como facilitadores se considera la división de tareas y el trabajo colaborativo del equipo. Las principales dificultades podrían ser la complejidad técnica y la disponibilidad de tiempo, las cuales se abordan mediante una planificación por etapas, distribución de responsabilidades y priorización de funcionalidades.</w:t>
+            </w:r>
+          </w:p>
+          <w:p>
+            <w:pPr>
+              <w:keepNext w:val="0"/>
+              <w:keepLines w:val="0"/>
+              <w:pageBreakBefore w:val="0"/>
+              <w:widowControl w:val="1"/>
+              <w:pBdr>
+                <w:top w:space="0" w:sz="0" w:val="nil"/>
+                <w:left w:space="0" w:sz="0" w:val="nil"/>
+                <w:bottom w:space="0" w:sz="0" w:val="nil"/>
+                <w:right w:space="0" w:sz="0" w:val="nil"/>
+                <w:between w:space="0" w:sz="0" w:val="nil"/>
+              </w:pBdr>
+              <w:shd w:fill="auto" w:val="clear"/>
+              <w:spacing w:after="160" w:before="0" w:line="259" w:lineRule="auto"/>
+              <w:ind w:left="0" w:right="0" w:firstLine="0"/>
+              <w:jc w:val="left"/>
+              <w:rPr>
+                <w:sz w:val="20"/>
+                <w:szCs w:val="20"/>
+              </w:rPr>
+            </w:pPr>
+            <w:r>
+              <w:rPr>
+                <w:sz w:val="20"/>
+                <w:szCs w:val="20"/>
+                <w:rtl w:val="0"/>
+              </w:rPr>
+              <w:t xml:space="preserve">Entre los factores externos y restricciones que deben considerarse se encuentra el cumplimiento de la normativa chilena sobre protección de datos personales. CitaJusta gestionará información asociada a usuarios, citas, instituciones, profesionales, listas de espera y procesos de reasignación, por lo que el proyecto deberá contemplar principios de seguridad, minimización de datos, control de acceso, confidencialidad y trazabilidad. Se considerará la Ley N.º 19.628 actualmente vigente y, de manera anticipada, los principios y obligaciones establecidos por la Ley N.º 21.719, cuya entrada en vigencia está prevista para el 1 de diciembre de 2026. Asimismo, CitaJusta no contempla almacenar fichas clínicas, diagnósticos ni antecedentes médicos en su MVP, limitándose a la gestión administrativa de citas. </w:t>
             </w:r>
             <w:r>
               <w:rPr>

</xml_diff>